<commit_message>
docs: :memo: Requirements update
</commit_message>
<xml_diff>
--- a/reports/Student #1/01 - Requirements - Student #1.docx
+++ b/reports/Student #1/01 - Requirements - Student #1.docx
@@ -585,7 +585,6 @@
               <w:sdtPr>
                 <w:rPr>
                   <w:rFonts w:asciiTheme="majorHAnsi" w:hAnsiTheme="majorHAnsi" w:cstheme="majorHAnsi"/>
-                  <w:u w:val="single"/>
                 </w:rPr>
                 <w:tag w:val="Moment"/>
                 <w:id w:val="-131097587"/>
@@ -599,37 +598,8 @@
                 <w:r>
                   <w:rPr>
                     <w:rFonts w:asciiTheme="majorHAnsi" w:hAnsiTheme="majorHAnsi" w:cstheme="majorHAnsi"/>
-                    <w:u w:val="single"/>
                   </w:rPr>
-                  <w:t xml:space="preserve"> Seville, 1</w:t>
-                </w:r>
-                <w:r>
-                  <w:rPr>
-                    <w:rFonts w:asciiTheme="majorHAnsi" w:hAnsiTheme="majorHAnsi" w:cstheme="majorHAnsi"/>
-                    <w:u w:val="single"/>
-                  </w:rPr>
-                  <w:t>3</w:t>
-                </w:r>
-                <w:r>
-                  <w:rPr>
-                    <w:rFonts w:asciiTheme="majorHAnsi" w:hAnsiTheme="majorHAnsi" w:cstheme="majorHAnsi"/>
-                    <w:u w:val="single"/>
-                  </w:rPr>
-                  <w:t xml:space="preserve"> of </w:t>
-                </w:r>
-                <w:r>
-                  <w:rPr>
-                    <w:rFonts w:asciiTheme="majorHAnsi" w:hAnsiTheme="majorHAnsi" w:cstheme="majorHAnsi"/>
-                    <w:u w:val="single"/>
-                  </w:rPr>
-                  <w:t>March</w:t>
-                </w:r>
-                <w:r>
-                  <w:rPr>
-                    <w:rFonts w:asciiTheme="majorHAnsi" w:hAnsiTheme="majorHAnsi" w:cstheme="majorHAnsi"/>
-                    <w:u w:val="single"/>
-                  </w:rPr>
-                  <w:t xml:space="preserve"> 2025</w:t>
+                  <w:t xml:space="preserve"> Seville, 17 of February 2025</w:t>
                 </w:r>
               </w:sdtContent>
             </w:sdt>
@@ -2897,7 +2867,13 @@
         </w:sdtPr>
         <w:sdtContent>
           <w:r>
-            <w:t xml:space="preserve">    </w:t>
+            <w:t xml:space="preserve"> </w:t>
+          </w:r>
+          <w:r>
+            <w:t>X</w:t>
+          </w:r>
+          <w:r>
+            <w:t xml:space="preserve"> </w:t>
           </w:r>
         </w:sdtContent>
       </w:sdt>
@@ -3042,7 +3018,13 @@
         </w:sdtPr>
         <w:sdtContent>
           <w:r>
-            <w:t xml:space="preserve">    </w:t>
+            <w:t xml:space="preserve"> </w:t>
+          </w:r>
+          <w:r>
+            <w:t>X</w:t>
+          </w:r>
+          <w:r>
+            <w:t xml:space="preserve"> </w:t>
           </w:r>
         </w:sdtContent>
       </w:sdt>
@@ -3171,7 +3153,13 @@
         </w:sdtPr>
         <w:sdtContent>
           <w:r>
-            <w:t xml:space="preserve">    </w:t>
+            <w:t xml:space="preserve"> </w:t>
+          </w:r>
+          <w:r>
+            <w:t>X</w:t>
+          </w:r>
+          <w:r>
+            <w:t xml:space="preserve"> </w:t>
           </w:r>
         </w:sdtContent>
       </w:sdt>
@@ -10289,6 +10277,7 @@
     <w:rsid w:val="001773D9"/>
     <w:rsid w:val="001942D6"/>
     <w:rsid w:val="002707DD"/>
+    <w:rsid w:val="002B0141"/>
     <w:rsid w:val="003124D9"/>
     <w:rsid w:val="00374B2C"/>
     <w:rsid w:val="003803AE"/>
@@ -10316,7 +10305,6 @@
     <w:rsid w:val="008B1087"/>
     <w:rsid w:val="0093034B"/>
     <w:rsid w:val="00953D97"/>
-    <w:rsid w:val="00961128"/>
     <w:rsid w:val="00A222AC"/>
     <w:rsid w:val="00A47EDD"/>
     <w:rsid w:val="00AD2A82"/>
@@ -10336,6 +10324,7 @@
     <w:rsid w:val="00D72CB9"/>
     <w:rsid w:val="00DA7CCF"/>
     <w:rsid w:val="00E25325"/>
+    <w:rsid w:val="00E331ED"/>
     <w:rsid w:val="00E64FA8"/>
     <w:rsid w:val="00F22BBC"/>
     <w:rsid w:val="00F430A4"/>

</xml_diff>

<commit_message>
docs: :memo: testing report added
</commit_message>
<xml_diff>
--- a/reports/Student #1/01 - Requirements - Student #1.docx
+++ b/reports/Student #1/01 - Requirements - Student #1.docx
@@ -4,7 +4,7 @@
   <w:body>
     <w:p>
       <w:pPr>
-        <w:pStyle w:val="Ttulo1"/>
+        <w:pStyle w:val="Heading1"/>
         <w:spacing w:before="0"/>
         <w:rPr>
           <w:rFonts w:cstheme="majorHAnsi"/>
@@ -620,7 +620,7 @@
     </w:p>
     <w:p>
       <w:pPr>
-        <w:pStyle w:val="Ttulo1"/>
+        <w:pStyle w:val="Heading1"/>
         <w:spacing w:before="0"/>
         <w:rPr>
           <w:rFonts w:cstheme="majorHAnsi"/>
@@ -654,7 +654,7 @@
     </w:p>
     <w:p>
       <w:pPr>
-        <w:pStyle w:val="Ttulo2"/>
+        <w:pStyle w:val="Heading2"/>
         <w:rPr>
           <w:rFonts w:cstheme="majorHAnsi"/>
         </w:rPr>
@@ -690,7 +690,7 @@
     </w:p>
     <w:p>
       <w:pPr>
-        <w:pStyle w:val="Ttulo2"/>
+        <w:pStyle w:val="Heading2"/>
         <w:rPr>
           <w:rFonts w:cstheme="majorHAnsi"/>
         </w:rPr>
@@ -929,7 +929,7 @@
     </w:p>
     <w:p>
       <w:pPr>
-        <w:pStyle w:val="Ttulo2"/>
+        <w:pStyle w:val="Heading2"/>
         <w:rPr>
           <w:rFonts w:cstheme="majorHAnsi"/>
         </w:rPr>
@@ -962,7 +962,7 @@
     </w:p>
     <w:p>
       <w:pPr>
-        <w:pStyle w:val="Ttulo2"/>
+        <w:pStyle w:val="Heading2"/>
         <w:rPr>
           <w:rFonts w:cstheme="majorHAnsi"/>
         </w:rPr>
@@ -995,7 +995,7 @@
     </w:p>
     <w:p>
       <w:pPr>
-        <w:pStyle w:val="Ttulo2"/>
+        <w:pStyle w:val="Heading2"/>
         <w:rPr>
           <w:rFonts w:cstheme="majorHAnsi"/>
         </w:rPr>
@@ -1123,7 +1123,7 @@
     </w:p>
     <w:p>
       <w:pPr>
-        <w:pStyle w:val="Ttulo1"/>
+        <w:pStyle w:val="Heading1"/>
         <w:tabs>
           <w:tab w:val="left" w:pos="284"/>
         </w:tabs>
@@ -1162,7 +1162,7 @@
     </w:p>
     <w:p>
       <w:pPr>
-        <w:pStyle w:val="Ttulo2"/>
+        <w:pStyle w:val="Heading2"/>
         <w:rPr>
           <w:rFonts w:cstheme="majorHAnsi"/>
           <w:lang w:val="en-US"/>
@@ -1525,7 +1525,7 @@
       </w:r>
       <w:r>
         <w:rPr>
-          <w:rStyle w:val="Textoennegrita"/>
+          <w:rStyle w:val="Strong"/>
           <w:lang w:val="en-GB"/>
         </w:rPr>
         <w:t>cost</w:t>
@@ -2216,7 +2216,7 @@
     <w:bookmarkEnd w:id="1"/>
     <w:p>
       <w:pPr>
-        <w:pStyle w:val="Ttulo2"/>
+        <w:pStyle w:val="Heading2"/>
         <w:rPr>
           <w:rFonts w:cstheme="majorHAnsi"/>
         </w:rPr>
@@ -2252,7 +2252,7 @@
     </w:p>
     <w:p>
       <w:pPr>
-        <w:pStyle w:val="Ttulo2"/>
+        <w:pStyle w:val="Heading2"/>
         <w:rPr>
           <w:rFonts w:cstheme="majorHAnsi"/>
         </w:rPr>
@@ -2288,7 +2288,7 @@
     </w:p>
     <w:p>
       <w:pPr>
-        <w:pStyle w:val="Ttulo2"/>
+        <w:pStyle w:val="Heading2"/>
         <w:rPr>
           <w:rFonts w:cstheme="majorHAnsi"/>
         </w:rPr>
@@ -2537,7 +2537,7 @@
     </w:p>
     <w:p>
       <w:pPr>
-        <w:pStyle w:val="Ttulo2"/>
+        <w:pStyle w:val="Heading2"/>
         <w:rPr>
           <w:rFonts w:cstheme="majorHAnsi"/>
         </w:rPr>
@@ -2635,7 +2635,7 @@
     </w:p>
     <w:p>
       <w:pPr>
-        <w:pStyle w:val="Ttulo1"/>
+        <w:pStyle w:val="Heading1"/>
         <w:pBdr>
           <w:top w:val="single" w:sz="8" w:space="1" w:color="auto"/>
           <w:left w:val="single" w:sz="8" w:space="4" w:color="auto"/>
@@ -2678,7 +2678,7 @@
     </w:p>
     <w:p>
       <w:pPr>
-        <w:pStyle w:val="Ttulo2"/>
+        <w:pStyle w:val="Heading2"/>
         <w:rPr>
           <w:rFonts w:cstheme="majorHAnsi"/>
         </w:rPr>
@@ -2714,7 +2714,7 @@
     </w:p>
     <w:p>
       <w:pPr>
-        <w:pStyle w:val="Ttulo2"/>
+        <w:pStyle w:val="Heading2"/>
         <w:rPr>
           <w:rFonts w:cstheme="majorHAnsi"/>
         </w:rPr>
@@ -3035,7 +3035,7 @@
     </w:p>
     <w:p>
       <w:pPr>
-        <w:pStyle w:val="Ttulo2"/>
+        <w:pStyle w:val="Heading2"/>
         <w:rPr>
           <w:rFonts w:cstheme="majorHAnsi"/>
         </w:rPr>
@@ -3071,7 +3071,7 @@
     </w:p>
     <w:p>
       <w:pPr>
-        <w:pStyle w:val="Ttulo2"/>
+        <w:pStyle w:val="Heading2"/>
         <w:rPr>
           <w:rFonts w:cstheme="majorHAnsi"/>
         </w:rPr>
@@ -3104,7 +3104,7 @@
     </w:p>
     <w:p>
       <w:pPr>
-        <w:pStyle w:val="Ttulo2"/>
+        <w:pStyle w:val="Heading2"/>
         <w:rPr>
           <w:rFonts w:cstheme="majorHAnsi"/>
         </w:rPr>
@@ -3177,7 +3177,7 @@
     </w:p>
     <w:p>
       <w:pPr>
-        <w:pStyle w:val="Ttulo1"/>
+        <w:pStyle w:val="Heading1"/>
         <w:tabs>
           <w:tab w:val="left" w:pos="284"/>
         </w:tabs>
@@ -3214,7 +3214,7 @@
     </w:p>
     <w:p>
       <w:pPr>
-        <w:pStyle w:val="Ttulo2"/>
+        <w:pStyle w:val="Heading2"/>
         <w:rPr>
           <w:rFonts w:cstheme="majorHAnsi"/>
         </w:rPr>
@@ -3260,7 +3260,13 @@
         </w:sdtPr>
         <w:sdtContent>
           <w:r>
-            <w:t xml:space="preserve">    </w:t>
+            <w:t xml:space="preserve"> </w:t>
+          </w:r>
+          <w:r>
+            <w:t>X</w:t>
+          </w:r>
+          <w:r>
+            <w:t xml:space="preserve">  </w:t>
           </w:r>
         </w:sdtContent>
       </w:sdt>
@@ -3271,7 +3277,7 @@
     </w:p>
     <w:p>
       <w:pPr>
-        <w:pStyle w:val="Ttulo2"/>
+        <w:pStyle w:val="Heading2"/>
         <w:rPr>
           <w:rFonts w:cstheme="majorHAnsi"/>
         </w:rPr>
@@ -3304,7 +3310,7 @@
     </w:p>
     <w:p>
       <w:pPr>
-        <w:pStyle w:val="Ttulo2"/>
+        <w:pStyle w:val="Heading2"/>
         <w:rPr>
           <w:rFonts w:cstheme="majorHAnsi"/>
         </w:rPr>
@@ -3337,7 +3343,7 @@
     </w:p>
     <w:p>
       <w:pPr>
-        <w:pStyle w:val="Ttulo2"/>
+        <w:pStyle w:val="Heading2"/>
         <w:rPr>
           <w:rFonts w:cstheme="majorHAnsi"/>
         </w:rPr>
@@ -3404,7 +3410,13 @@
         </w:sdtPr>
         <w:sdtContent>
           <w:r>
-            <w:t xml:space="preserve">    </w:t>
+            <w:t xml:space="preserve"> </w:t>
+          </w:r>
+          <w:r>
+            <w:t>X</w:t>
+          </w:r>
+          <w:r>
+            <w:t xml:space="preserve">  </w:t>
           </w:r>
         </w:sdtContent>
       </w:sdt>
@@ -3421,7 +3433,7 @@
     </w:p>
     <w:p>
       <w:pPr>
-        <w:pStyle w:val="Ttulo2"/>
+        <w:pStyle w:val="Heading2"/>
         <w:rPr>
           <w:rFonts w:cstheme="majorHAnsi"/>
         </w:rPr>
@@ -3476,7 +3488,13 @@
         </w:sdtPr>
         <w:sdtContent>
           <w:r>
-            <w:t xml:space="preserve">    </w:t>
+            <w:t xml:space="preserve"> </w:t>
+          </w:r>
+          <w:r>
+            <w:t>X</w:t>
+          </w:r>
+          <w:r>
+            <w:t xml:space="preserve">  </w:t>
           </w:r>
         </w:sdtContent>
       </w:sdt>
@@ -3513,7 +3531,13 @@
         </w:sdtPr>
         <w:sdtContent>
           <w:r>
-            <w:t xml:space="preserve">    </w:t>
+            <w:t xml:space="preserve"> </w:t>
+          </w:r>
+          <w:r>
+            <w:t>X</w:t>
+          </w:r>
+          <w:r>
+            <w:t xml:space="preserve">  </w:t>
           </w:r>
         </w:sdtContent>
       </w:sdt>
@@ -3549,7 +3573,7 @@
     </w:p>
     <w:p>
       <w:pPr>
-        <w:pStyle w:val="Ttulo1"/>
+        <w:pStyle w:val="Heading1"/>
         <w:spacing w:before="0"/>
         <w:rPr>
           <w:rFonts w:cstheme="majorHAnsi"/>
@@ -3583,7 +3607,7 @@
     </w:p>
     <w:p>
       <w:pPr>
-        <w:pStyle w:val="Ttulo2"/>
+        <w:pStyle w:val="Heading2"/>
         <w:rPr>
           <w:rFonts w:cstheme="majorHAnsi"/>
         </w:rPr>
@@ -3619,7 +3643,7 @@
     </w:p>
     <w:p>
       <w:pPr>
-        <w:pStyle w:val="Ttulo2"/>
+        <w:pStyle w:val="Heading2"/>
         <w:rPr>
           <w:rFonts w:cstheme="majorHAnsi"/>
         </w:rPr>
@@ -3652,7 +3676,7 @@
     </w:p>
     <w:p>
       <w:pPr>
-        <w:pStyle w:val="Ttulo2"/>
+        <w:pStyle w:val="Heading2"/>
         <w:rPr>
           <w:rFonts w:cstheme="majorHAnsi"/>
         </w:rPr>
@@ -3685,7 +3709,7 @@
     </w:p>
     <w:p>
       <w:pPr>
-        <w:pStyle w:val="Ttulo2"/>
+        <w:pStyle w:val="Heading2"/>
         <w:rPr>
           <w:rFonts w:cstheme="majorHAnsi"/>
         </w:rPr>
@@ -3718,7 +3742,7 @@
     </w:p>
     <w:p>
       <w:pPr>
-        <w:pStyle w:val="Ttulo2"/>
+        <w:pStyle w:val="Heading2"/>
         <w:rPr>
           <w:rFonts w:cstheme="majorHAnsi"/>
         </w:rPr>
@@ -3796,7 +3820,7 @@
     </w:p>
     <w:p>
       <w:pPr>
-        <w:pStyle w:val="Ttulo1"/>
+        <w:pStyle w:val="Heading1"/>
         <w:tabs>
           <w:tab w:val="left" w:pos="284"/>
         </w:tabs>
@@ -3835,7 +3859,7 @@
     </w:p>
     <w:p>
       <w:pPr>
-        <w:pStyle w:val="Ttulo2"/>
+        <w:pStyle w:val="Heading2"/>
         <w:rPr>
           <w:rFonts w:cstheme="majorHAnsi"/>
           <w:lang w:val="en-US"/>
@@ -4039,7 +4063,13 @@
         </w:sdtPr>
         <w:sdtContent>
           <w:r>
-            <w:t xml:space="preserve">    </w:t>
+            <w:t xml:space="preserve"> </w:t>
+          </w:r>
+          <w:r>
+            <w:t>X</w:t>
+          </w:r>
+          <w:r>
+            <w:t xml:space="preserve"> </w:t>
           </w:r>
         </w:sdtContent>
       </w:sdt>
@@ -4057,7 +4087,7 @@
     </w:p>
     <w:p>
       <w:pPr>
-        <w:pStyle w:val="Ttulo2"/>
+        <w:pStyle w:val="Heading2"/>
         <w:rPr>
           <w:rFonts w:cstheme="majorHAnsi"/>
         </w:rPr>
@@ -4093,7 +4123,7 @@
     </w:p>
     <w:p>
       <w:pPr>
-        <w:pStyle w:val="Ttulo2"/>
+        <w:pStyle w:val="Heading2"/>
         <w:rPr>
           <w:rFonts w:cstheme="majorHAnsi"/>
         </w:rPr>
@@ -4129,7 +4159,7 @@
     </w:p>
     <w:p>
       <w:pPr>
-        <w:pStyle w:val="Ttulo2"/>
+        <w:pStyle w:val="Heading2"/>
         <w:rPr>
           <w:rFonts w:cstheme="majorHAnsi"/>
         </w:rPr>
@@ -4162,7 +4192,7 @@
     </w:p>
     <w:p>
       <w:pPr>
-        <w:pStyle w:val="Ttulo2"/>
+        <w:pStyle w:val="Heading2"/>
         <w:rPr>
           <w:rFonts w:cstheme="majorHAnsi"/>
         </w:rPr>
@@ -4228,7 +4258,7 @@
     </w:p>
     <w:p>
       <w:pPr>
-        <w:pStyle w:val="Ttulo1"/>
+        <w:pStyle w:val="Heading1"/>
         <w:pBdr>
           <w:top w:val="single" w:sz="8" w:space="1" w:color="auto"/>
           <w:left w:val="single" w:sz="8" w:space="4" w:color="auto"/>
@@ -4271,7 +4301,7 @@
     </w:p>
     <w:p>
       <w:pPr>
-        <w:pStyle w:val="Ttulo2"/>
+        <w:pStyle w:val="Heading2"/>
         <w:rPr>
           <w:rFonts w:cstheme="majorHAnsi"/>
         </w:rPr>
@@ -4307,7 +4337,7 @@
     </w:p>
     <w:p>
       <w:pPr>
-        <w:pStyle w:val="Ttulo2"/>
+        <w:pStyle w:val="Heading2"/>
         <w:rPr>
           <w:rFonts w:cstheme="majorHAnsi"/>
         </w:rPr>
@@ -4389,7 +4419,13 @@
         </w:sdtPr>
         <w:sdtContent>
           <w:r>
-            <w:t xml:space="preserve">    </w:t>
+            <w:t xml:space="preserve"> </w:t>
+          </w:r>
+          <w:r>
+            <w:t>X</w:t>
+          </w:r>
+          <w:r>
+            <w:t xml:space="preserve">  </w:t>
           </w:r>
         </w:sdtContent>
       </w:sdt>
@@ -4482,7 +4518,13 @@
         </w:sdtPr>
         <w:sdtContent>
           <w:r>
-            <w:t xml:space="preserve">    </w:t>
+            <w:t xml:space="preserve"> </w:t>
+          </w:r>
+          <w:r>
+            <w:t>X</w:t>
+          </w:r>
+          <w:r>
+            <w:t xml:space="preserve"> </w:t>
           </w:r>
         </w:sdtContent>
       </w:sdt>
@@ -4572,7 +4614,13 @@
         </w:sdtPr>
         <w:sdtContent>
           <w:r>
-            <w:t xml:space="preserve">    </w:t>
+            <w:t xml:space="preserve"> </w:t>
+          </w:r>
+          <w:r>
+            <w:t>X</w:t>
+          </w:r>
+          <w:r>
+            <w:t xml:space="preserve"> </w:t>
           </w:r>
         </w:sdtContent>
       </w:sdt>
@@ -4663,7 +4711,13 @@
         </w:sdtPr>
         <w:sdtContent>
           <w:r>
-            <w:t xml:space="preserve">    </w:t>
+            <w:t xml:space="preserve"> </w:t>
+          </w:r>
+          <w:r>
+            <w:t>X</w:t>
+          </w:r>
+          <w:r>
+            <w:t xml:space="preserve">  </w:t>
           </w:r>
         </w:sdtContent>
       </w:sdt>
@@ -4680,7 +4734,7 @@
     </w:p>
     <w:p>
       <w:pPr>
-        <w:pStyle w:val="Ttulo2"/>
+        <w:pStyle w:val="Heading2"/>
         <w:rPr>
           <w:rFonts w:cstheme="majorHAnsi"/>
         </w:rPr>
@@ -4716,7 +4770,7 @@
     </w:p>
     <w:p>
       <w:pPr>
-        <w:pStyle w:val="Ttulo2"/>
+        <w:pStyle w:val="Heading2"/>
         <w:rPr>
           <w:rFonts w:cstheme="majorHAnsi"/>
         </w:rPr>
@@ -4749,7 +4803,7 @@
     </w:p>
     <w:p>
       <w:pPr>
-        <w:pStyle w:val="Ttulo2"/>
+        <w:pStyle w:val="Heading2"/>
         <w:rPr>
           <w:rFonts w:cstheme="majorHAnsi"/>
         </w:rPr>
@@ -4834,7 +4888,7 @@
     </w:p>
     <w:p>
       <w:pPr>
-        <w:pStyle w:val="Ttulo1"/>
+        <w:pStyle w:val="Heading1"/>
         <w:tabs>
           <w:tab w:val="left" w:pos="284"/>
         </w:tabs>
@@ -4871,7 +4925,7 @@
     </w:p>
     <w:p>
       <w:pPr>
-        <w:pStyle w:val="Ttulo2"/>
+        <w:pStyle w:val="Heading2"/>
         <w:rPr>
           <w:rFonts w:cstheme="majorHAnsi"/>
         </w:rPr>
@@ -4904,7 +4958,7 @@
     </w:p>
     <w:p>
       <w:pPr>
-        <w:pStyle w:val="Ttulo2"/>
+        <w:pStyle w:val="Heading2"/>
         <w:rPr>
           <w:rFonts w:cstheme="majorHAnsi"/>
         </w:rPr>
@@ -4937,7 +4991,7 @@
     </w:p>
     <w:p>
       <w:pPr>
-        <w:pStyle w:val="Ttulo2"/>
+        <w:pStyle w:val="Heading2"/>
         <w:rPr>
           <w:rFonts w:cstheme="majorHAnsi"/>
         </w:rPr>
@@ -4970,7 +5024,7 @@
     </w:p>
     <w:p>
       <w:pPr>
-        <w:pStyle w:val="Ttulo2"/>
+        <w:pStyle w:val="Heading2"/>
         <w:rPr>
           <w:rFonts w:cstheme="majorHAnsi"/>
         </w:rPr>
@@ -5048,7 +5102,7 @@
     </w:p>
     <w:p>
       <w:pPr>
-        <w:pStyle w:val="Ttulo2"/>
+        <w:pStyle w:val="Heading2"/>
         <w:rPr>
           <w:rFonts w:cstheme="majorHAnsi"/>
         </w:rPr>
@@ -5150,7 +5204,7 @@
     </w:p>
     <w:p>
       <w:pPr>
-        <w:pStyle w:val="Ttulo1"/>
+        <w:pStyle w:val="Heading1"/>
         <w:spacing w:before="0"/>
         <w:rPr>
           <w:rFonts w:cstheme="majorHAnsi"/>
@@ -5184,7 +5238,7 @@
     </w:p>
     <w:p>
       <w:pPr>
-        <w:pStyle w:val="Ttulo2"/>
+        <w:pStyle w:val="Heading2"/>
         <w:rPr>
           <w:rFonts w:cstheme="majorHAnsi"/>
         </w:rPr>
@@ -5220,7 +5274,7 @@
     </w:p>
     <w:p>
       <w:pPr>
-        <w:pStyle w:val="Ttulo2"/>
+        <w:pStyle w:val="Heading2"/>
         <w:rPr>
           <w:rFonts w:cstheme="majorHAnsi"/>
         </w:rPr>
@@ -5253,7 +5307,7 @@
     </w:p>
     <w:p>
       <w:pPr>
-        <w:pStyle w:val="Ttulo2"/>
+        <w:pStyle w:val="Heading2"/>
         <w:rPr>
           <w:rFonts w:cstheme="majorHAnsi"/>
         </w:rPr>
@@ -5286,7 +5340,7 @@
     </w:p>
     <w:p>
       <w:pPr>
-        <w:pStyle w:val="Ttulo2"/>
+        <w:pStyle w:val="Heading2"/>
         <w:rPr>
           <w:rFonts w:cstheme="majorHAnsi"/>
         </w:rPr>
@@ -5319,7 +5373,7 @@
     </w:p>
     <w:p>
       <w:pPr>
-        <w:pStyle w:val="Ttulo2"/>
+        <w:pStyle w:val="Heading2"/>
         <w:rPr>
           <w:rFonts w:cstheme="majorHAnsi"/>
         </w:rPr>
@@ -5472,7 +5526,7 @@
     </w:p>
     <w:p>
       <w:pPr>
-        <w:pStyle w:val="Ttulo1"/>
+        <w:pStyle w:val="Heading1"/>
         <w:tabs>
           <w:tab w:val="left" w:pos="284"/>
         </w:tabs>
@@ -5511,7 +5565,7 @@
     </w:p>
     <w:p>
       <w:pPr>
-        <w:pStyle w:val="Ttulo2"/>
+        <w:pStyle w:val="Heading2"/>
         <w:rPr>
           <w:rFonts w:cstheme="majorHAnsi"/>
           <w:lang w:val="en-US"/>
@@ -5665,7 +5719,7 @@
     </w:p>
     <w:p>
       <w:pPr>
-        <w:pStyle w:val="Ttulo2"/>
+        <w:pStyle w:val="Heading2"/>
         <w:rPr>
           <w:rFonts w:cstheme="majorHAnsi"/>
         </w:rPr>
@@ -5701,7 +5755,7 @@
     </w:p>
     <w:p>
       <w:pPr>
-        <w:pStyle w:val="Ttulo2"/>
+        <w:pStyle w:val="Heading2"/>
         <w:rPr>
           <w:rFonts w:cstheme="majorHAnsi"/>
         </w:rPr>
@@ -5737,7 +5791,7 @@
     </w:p>
     <w:p>
       <w:pPr>
-        <w:pStyle w:val="Ttulo2"/>
+        <w:pStyle w:val="Heading2"/>
         <w:rPr>
           <w:rFonts w:cstheme="majorHAnsi"/>
         </w:rPr>
@@ -5770,7 +5824,7 @@
     </w:p>
     <w:p>
       <w:pPr>
-        <w:pStyle w:val="Ttulo2"/>
+        <w:pStyle w:val="Heading2"/>
         <w:rPr>
           <w:rFonts w:cstheme="majorHAnsi"/>
         </w:rPr>
@@ -5879,7 +5933,7 @@
     </w:p>
     <w:p>
       <w:pPr>
-        <w:pStyle w:val="Ttulo1"/>
+        <w:pStyle w:val="Heading1"/>
         <w:pBdr>
           <w:top w:val="single" w:sz="8" w:space="1" w:color="auto"/>
           <w:left w:val="single" w:sz="8" w:space="4" w:color="auto"/>
@@ -5922,7 +5976,7 @@
     </w:p>
     <w:p>
       <w:pPr>
-        <w:pStyle w:val="Ttulo2"/>
+        <w:pStyle w:val="Heading2"/>
         <w:rPr>
           <w:rFonts w:cstheme="majorHAnsi"/>
         </w:rPr>
@@ -5958,7 +6012,7 @@
     </w:p>
     <w:p>
       <w:pPr>
-        <w:pStyle w:val="Ttulo2"/>
+        <w:pStyle w:val="Heading2"/>
         <w:rPr>
           <w:rFonts w:cstheme="majorHAnsi"/>
         </w:rPr>
@@ -6146,7 +6200,7 @@
     </w:p>
     <w:p>
       <w:pPr>
-        <w:pStyle w:val="Ttulo2"/>
+        <w:pStyle w:val="Heading2"/>
         <w:rPr>
           <w:rFonts w:cstheme="majorHAnsi"/>
         </w:rPr>
@@ -6182,7 +6236,7 @@
     </w:p>
     <w:p>
       <w:pPr>
-        <w:pStyle w:val="Ttulo2"/>
+        <w:pStyle w:val="Heading2"/>
         <w:rPr>
           <w:rFonts w:cstheme="majorHAnsi"/>
         </w:rPr>
@@ -6215,7 +6269,7 @@
     </w:p>
     <w:p>
       <w:pPr>
-        <w:pStyle w:val="Ttulo2"/>
+        <w:pStyle w:val="Heading2"/>
         <w:rPr>
           <w:rFonts w:cstheme="majorHAnsi"/>
         </w:rPr>
@@ -6312,7 +6366,7 @@
     </w:p>
     <w:p>
       <w:pPr>
-        <w:pStyle w:val="Ttulo1"/>
+        <w:pStyle w:val="Heading1"/>
         <w:tabs>
           <w:tab w:val="left" w:pos="284"/>
         </w:tabs>
@@ -6349,7 +6403,7 @@
     </w:p>
     <w:p>
       <w:pPr>
-        <w:pStyle w:val="Ttulo2"/>
+        <w:pStyle w:val="Heading2"/>
         <w:rPr>
           <w:rFonts w:cstheme="majorHAnsi"/>
         </w:rPr>
@@ -6382,7 +6436,7 @@
     </w:p>
     <w:p>
       <w:pPr>
-        <w:pStyle w:val="Ttulo2"/>
+        <w:pStyle w:val="Heading2"/>
         <w:rPr>
           <w:rFonts w:cstheme="majorHAnsi"/>
         </w:rPr>
@@ -6415,7 +6469,7 @@
     </w:p>
     <w:p>
       <w:pPr>
-        <w:pStyle w:val="Ttulo2"/>
+        <w:pStyle w:val="Heading2"/>
         <w:rPr>
           <w:rFonts w:cstheme="majorHAnsi"/>
         </w:rPr>
@@ -6448,7 +6502,7 @@
     </w:p>
     <w:p>
       <w:pPr>
-        <w:pStyle w:val="Ttulo2"/>
+        <w:pStyle w:val="Heading2"/>
         <w:rPr>
           <w:rFonts w:cstheme="majorHAnsi"/>
         </w:rPr>
@@ -6520,7 +6574,7 @@
     </w:p>
     <w:p>
       <w:pPr>
-        <w:pStyle w:val="Ttulo2"/>
+        <w:pStyle w:val="Heading2"/>
         <w:rPr>
           <w:rFonts w:cstheme="majorHAnsi"/>
         </w:rPr>
@@ -6641,7 +6695,7 @@
     <w:lvl w:ilvl="0">
       <w:start w:val="1"/>
       <w:numFmt w:val="decimal"/>
-      <w:pStyle w:val="Listaconnmeros"/>
+      <w:pStyle w:val="ListNumber"/>
       <w:lvlText w:val="%1."/>
       <w:lvlJc w:val="left"/>
       <w:pPr>
@@ -7386,7 +7440,7 @@
     <w:lvl w:ilvl="0" w:tplc="391EA46E">
       <w:start w:val="1"/>
       <w:numFmt w:val="decimal"/>
-      <w:pStyle w:val="Prrafodelista"/>
+      <w:pStyle w:val="ListParagraph"/>
       <w:lvlText w:val="%1)"/>
       <w:lvlJc w:val="left"/>
       <w:pPr>
@@ -8516,11 +8570,11 @@
       <w:lang w:val="en-GB"/>
     </w:rPr>
   </w:style>
-  <w:style w:type="paragraph" w:styleId="Ttulo1">
+  <w:style w:type="paragraph" w:styleId="Heading1">
     <w:name w:val="heading 1"/>
     <w:basedOn w:val="Normal"/>
     <w:next w:val="Normal"/>
-    <w:link w:val="Ttulo1Car"/>
+    <w:link w:val="Heading1Char"/>
     <w:uiPriority w:val="9"/>
     <w:qFormat/>
     <w:rsid w:val="00C41FD1"/>
@@ -8548,11 +8602,11 @@
       <w14:ligatures w14:val="none"/>
     </w:rPr>
   </w:style>
-  <w:style w:type="paragraph" w:styleId="Ttulo2">
+  <w:style w:type="paragraph" w:styleId="Heading2">
     <w:name w:val="heading 2"/>
     <w:basedOn w:val="Normal"/>
     <w:next w:val="Normal"/>
-    <w:link w:val="Ttulo2Car"/>
+    <w:link w:val="Heading2Char"/>
     <w:uiPriority w:val="9"/>
     <w:unhideWhenUsed/>
     <w:qFormat/>
@@ -8576,11 +8630,11 @@
       <w14:ligatures w14:val="none"/>
     </w:rPr>
   </w:style>
-  <w:style w:type="paragraph" w:styleId="Ttulo3">
+  <w:style w:type="paragraph" w:styleId="Heading3">
     <w:name w:val="heading 3"/>
     <w:basedOn w:val="Normal"/>
     <w:next w:val="Normal"/>
-    <w:link w:val="Ttulo3Car"/>
+    <w:link w:val="Heading3Char"/>
     <w:uiPriority w:val="9"/>
     <w:unhideWhenUsed/>
     <w:rsid w:val="00C41FD1"/>
@@ -8595,13 +8649,13 @@
       <w:color w:val="1F3763" w:themeColor="accent1" w:themeShade="7F"/>
     </w:rPr>
   </w:style>
-  <w:style w:type="character" w:default="1" w:styleId="Fuentedeprrafopredeter">
+  <w:style w:type="character" w:default="1" w:styleId="DefaultParagraphFont">
     <w:name w:val="Default Paragraph Font"/>
     <w:uiPriority w:val="1"/>
     <w:semiHidden/>
     <w:unhideWhenUsed/>
   </w:style>
-  <w:style w:type="table" w:default="1" w:styleId="Tablanormal">
+  <w:style w:type="table" w:default="1" w:styleId="TableNormal">
     <w:name w:val="Normal Table"/>
     <w:uiPriority w:val="99"/>
     <w:semiHidden/>
@@ -8616,16 +8670,16 @@
       </w:tblCellMar>
     </w:tblPr>
   </w:style>
-  <w:style w:type="numbering" w:default="1" w:styleId="Sinlista">
+  <w:style w:type="numbering" w:default="1" w:styleId="NoList">
     <w:name w:val="No List"/>
     <w:uiPriority w:val="99"/>
     <w:semiHidden/>
     <w:unhideWhenUsed/>
   </w:style>
-  <w:style w:type="character" w:customStyle="1" w:styleId="Ttulo1Car">
-    <w:name w:val="Título 1 Car"/>
-    <w:basedOn w:val="Fuentedeprrafopredeter"/>
-    <w:link w:val="Ttulo1"/>
+  <w:style w:type="character" w:customStyle="1" w:styleId="Heading1Char">
+    <w:name w:val="Heading 1 Char"/>
+    <w:basedOn w:val="DefaultParagraphFont"/>
+    <w:link w:val="Heading1"/>
     <w:uiPriority w:val="9"/>
     <w:rsid w:val="00C41FD1"/>
     <w:rPr>
@@ -8639,10 +8693,10 @@
       <w14:ligatures w14:val="none"/>
     </w:rPr>
   </w:style>
-  <w:style w:type="character" w:customStyle="1" w:styleId="Ttulo2Car">
-    <w:name w:val="Título 2 Car"/>
-    <w:basedOn w:val="Fuentedeprrafopredeter"/>
-    <w:link w:val="Ttulo2"/>
+  <w:style w:type="character" w:customStyle="1" w:styleId="Heading2Char">
+    <w:name w:val="Heading 2 Char"/>
+    <w:basedOn w:val="DefaultParagraphFont"/>
+    <w:link w:val="Heading2"/>
     <w:uiPriority w:val="9"/>
     <w:rsid w:val="00C41FD1"/>
     <w:rPr>
@@ -8656,9 +8710,9 @@
       <w14:ligatures w14:val="none"/>
     </w:rPr>
   </w:style>
-  <w:style w:type="paragraph" w:styleId="Prrafodelista">
+  <w:style w:type="paragraph" w:styleId="ListParagraph">
     <w:name w:val="List Paragraph"/>
-    <w:basedOn w:val="Listaconnmeros"/>
+    <w:basedOn w:val="ListNumber"/>
     <w:uiPriority w:val="34"/>
     <w:rsid w:val="00C41FD1"/>
     <w:pPr>
@@ -8677,7 +8731,7 @@
   </w:style>
   <w:style w:type="paragraph" w:customStyle="1" w:styleId="Prrafodesublista">
     <w:name w:val="Párrafo de sublista"/>
-    <w:basedOn w:val="Prrafodelista"/>
+    <w:basedOn w:val="ListParagraph"/>
     <w:qFormat/>
     <w:rsid w:val="009A2770"/>
     <w:pPr>
@@ -8687,9 +8741,9 @@
       <w:rFonts w:eastAsia="Courier New" w:cs="Courier New"/>
     </w:rPr>
   </w:style>
-  <w:style w:type="character" w:styleId="Refdecomentario">
+  <w:style w:type="character" w:styleId="CommentReference">
     <w:name w:val="annotation reference"/>
-    <w:basedOn w:val="Fuentedeprrafopredeter"/>
+    <w:basedOn w:val="DefaultParagraphFont"/>
     <w:uiPriority w:val="99"/>
     <w:semiHidden/>
     <w:unhideWhenUsed/>
@@ -8699,10 +8753,10 @@
       <w:szCs w:val="16"/>
     </w:rPr>
   </w:style>
-  <w:style w:type="paragraph" w:styleId="Textocomentario">
+  <w:style w:type="paragraph" w:styleId="CommentText">
     <w:name w:val="annotation text"/>
     <w:basedOn w:val="Normal"/>
-    <w:link w:val="TextocomentarioCar"/>
+    <w:link w:val="CommentTextChar"/>
     <w:uiPriority w:val="99"/>
     <w:unhideWhenUsed/>
     <w:rsid w:val="00315751"/>
@@ -8711,10 +8765,10 @@
       <w:szCs w:val="20"/>
     </w:rPr>
   </w:style>
-  <w:style w:type="character" w:customStyle="1" w:styleId="TextocomentarioCar">
-    <w:name w:val="Texto comentario Car"/>
-    <w:basedOn w:val="Fuentedeprrafopredeter"/>
-    <w:link w:val="Textocomentario"/>
+  <w:style w:type="character" w:customStyle="1" w:styleId="CommentTextChar">
+    <w:name w:val="Comment Text Char"/>
+    <w:basedOn w:val="DefaultParagraphFont"/>
+    <w:link w:val="CommentText"/>
     <w:uiPriority w:val="99"/>
     <w:rsid w:val="00315751"/>
     <w:rPr>
@@ -8725,11 +8779,11 @@
       <w14:ligatures w14:val="none"/>
     </w:rPr>
   </w:style>
-  <w:style w:type="paragraph" w:styleId="Asuntodelcomentario">
+  <w:style w:type="paragraph" w:styleId="CommentSubject">
     <w:name w:val="annotation subject"/>
     <w:basedOn w:val="Normal"/>
     <w:next w:val="Normal"/>
-    <w:link w:val="AsuntodelcomentarioCar"/>
+    <w:link w:val="CommentSubjectChar"/>
     <w:uiPriority w:val="99"/>
     <w:semiHidden/>
     <w:unhideWhenUsed/>
@@ -8741,10 +8795,10 @@
       <w:szCs w:val="20"/>
     </w:rPr>
   </w:style>
-  <w:style w:type="character" w:customStyle="1" w:styleId="AsuntodelcomentarioCar">
-    <w:name w:val="Asunto del comentario Car"/>
-    <w:basedOn w:val="Fuentedeprrafopredeter"/>
-    <w:link w:val="Asuntodelcomentario"/>
+  <w:style w:type="character" w:customStyle="1" w:styleId="CommentSubjectChar">
+    <w:name w:val="Comment Subject Char"/>
+    <w:basedOn w:val="DefaultParagraphFont"/>
+    <w:link w:val="CommentSubject"/>
     <w:uiPriority w:val="99"/>
     <w:semiHidden/>
     <w:rsid w:val="00C41FD1"/>
@@ -8756,9 +8810,9 @@
       <w:lang w:val="en-GB"/>
     </w:rPr>
   </w:style>
-  <w:style w:type="character" w:styleId="Hipervnculo">
+  <w:style w:type="character" w:styleId="Hyperlink">
     <w:name w:val="Hyperlink"/>
-    <w:basedOn w:val="Fuentedeprrafopredeter"/>
+    <w:basedOn w:val="DefaultParagraphFont"/>
     <w:uiPriority w:val="99"/>
     <w:unhideWhenUsed/>
     <w:rsid w:val="00C41FD1"/>
@@ -8767,9 +8821,9 @@
       <w:u w:val="single"/>
     </w:rPr>
   </w:style>
-  <w:style w:type="character" w:styleId="Textodelmarcadordeposicin">
+  <w:style w:type="character" w:styleId="PlaceholderText">
     <w:name w:val="Placeholder Text"/>
-    <w:basedOn w:val="Fuentedeprrafopredeter"/>
+    <w:basedOn w:val="DefaultParagraphFont"/>
     <w:uiPriority w:val="99"/>
     <w:semiHidden/>
     <w:rsid w:val="00C41FD1"/>
@@ -8812,10 +8866,10 @@
       <w:spacing w:before="240" w:after="240"/>
     </w:pPr>
   </w:style>
-  <w:style w:type="character" w:customStyle="1" w:styleId="Ttulo3Car">
-    <w:name w:val="Título 3 Car"/>
-    <w:basedOn w:val="Fuentedeprrafopredeter"/>
-    <w:link w:val="Ttulo3"/>
+  <w:style w:type="character" w:customStyle="1" w:styleId="Heading3Char">
+    <w:name w:val="Heading 3 Char"/>
+    <w:basedOn w:val="DefaultParagraphFont"/>
+    <w:link w:val="Heading3"/>
     <w:uiPriority w:val="9"/>
     <w:rsid w:val="00C41FD1"/>
     <w:rPr>
@@ -8826,7 +8880,7 @@
       <w:lang w:val="en-GB"/>
     </w:rPr>
   </w:style>
-  <w:style w:type="paragraph" w:styleId="Lista">
+  <w:style w:type="paragraph" w:styleId="List">
     <w:name w:val="List"/>
     <w:basedOn w:val="Normal"/>
     <w:uiPriority w:val="99"/>
@@ -8838,7 +8892,7 @@
       <w:contextualSpacing/>
     </w:pPr>
   </w:style>
-  <w:style w:type="paragraph" w:styleId="Listaconnmeros">
+  <w:style w:type="paragraph" w:styleId="ListNumber">
     <w:name w:val="List Number"/>
     <w:basedOn w:val="Normal"/>
     <w:uiPriority w:val="99"/>
@@ -8854,7 +8908,7 @@
   </w:style>
   <w:style w:type="paragraph" w:customStyle="1" w:styleId="Requirement-Body">
     <w:name w:val="Requirement - Body"/>
-    <w:basedOn w:val="Lista"/>
+    <w:basedOn w:val="List"/>
     <w:qFormat/>
     <w:rsid w:val="007347EC"/>
     <w:pPr>
@@ -8866,7 +8920,7 @@
   </w:style>
   <w:style w:type="paragraph" w:customStyle="1" w:styleId="Requirement-Header">
     <w:name w:val="Requirement - Header"/>
-    <w:basedOn w:val="Lista"/>
+    <w:basedOn w:val="List"/>
     <w:next w:val="Requirement-Body"/>
     <w:qFormat/>
     <w:rsid w:val="00C61300"/>
@@ -8880,9 +8934,9 @@
       <w:lang w:val="es-ES"/>
     </w:rPr>
   </w:style>
-  <w:style w:type="character" w:styleId="Textoennegrita">
+  <w:style w:type="character" w:styleId="Strong">
     <w:name w:val="Strong"/>
-    <w:basedOn w:val="Fuentedeprrafopredeter"/>
+    <w:basedOn w:val="DefaultParagraphFont"/>
     <w:uiPriority w:val="22"/>
     <w:qFormat/>
     <w:rsid w:val="00C41FD1"/>
@@ -8891,11 +8945,11 @@
       <w:bCs/>
     </w:rPr>
   </w:style>
-  <w:style w:type="paragraph" w:styleId="Ttulo">
+  <w:style w:type="paragraph" w:styleId="Title">
     <w:name w:val="Title"/>
     <w:basedOn w:val="Normal"/>
     <w:next w:val="Normal"/>
-    <w:link w:val="TtuloCar"/>
+    <w:link w:val="TitleChar"/>
     <w:uiPriority w:val="10"/>
     <w:qFormat/>
     <w:rsid w:val="00C41FD1"/>
@@ -8916,10 +8970,10 @@
       <w:szCs w:val="56"/>
     </w:rPr>
   </w:style>
-  <w:style w:type="character" w:customStyle="1" w:styleId="TtuloCar">
-    <w:name w:val="Título Car"/>
-    <w:basedOn w:val="Fuentedeprrafopredeter"/>
-    <w:link w:val="Ttulo"/>
+  <w:style w:type="character" w:customStyle="1" w:styleId="TitleChar">
+    <w:name w:val="Title Char"/>
+    <w:basedOn w:val="DefaultParagraphFont"/>
+    <w:link w:val="Title"/>
     <w:uiPriority w:val="10"/>
     <w:rsid w:val="00C41FD1"/>
     <w:rPr>
@@ -8959,7 +9013,7 @@
           </w:pPr>
           <w:r>
             <w:rPr>
-              <w:rStyle w:val="Textodelmarcadordeposicin"/>
+              <w:rStyle w:val="PlaceholderText"/>
             </w:rPr>
             <w:t>Haga clic o pulse aquí para escribir texto.</w:t>
           </w:r>
@@ -8988,7 +9042,7 @@
           </w:pPr>
           <w:r>
             <w:rPr>
-              <w:rStyle w:val="Textodelmarcadordeposicin"/>
+              <w:rStyle w:val="PlaceholderText"/>
             </w:rPr>
             <w:t>Haga clic o pulse aquí para escribir texto.</w:t>
           </w:r>
@@ -9017,7 +9071,7 @@
           </w:pPr>
           <w:r>
             <w:rPr>
-              <w:rStyle w:val="Textodelmarcadordeposicin"/>
+              <w:rStyle w:val="PlaceholderText"/>
             </w:rPr>
             <w:t>Haga clic o pulse aquí para escribir texto.</w:t>
           </w:r>
@@ -9046,7 +9100,7 @@
           </w:pPr>
           <w:r>
             <w:rPr>
-              <w:rStyle w:val="Textodelmarcadordeposicin"/>
+              <w:rStyle w:val="PlaceholderText"/>
             </w:rPr>
             <w:t>Haga clic o pulse aquí para escribir texto.</w:t>
           </w:r>
@@ -9075,7 +9129,7 @@
           </w:pPr>
           <w:r>
             <w:rPr>
-              <w:rStyle w:val="Textodelmarcadordeposicin"/>
+              <w:rStyle w:val="PlaceholderText"/>
             </w:rPr>
             <w:t>Haga clic o pulse aquí para escribir texto.</w:t>
           </w:r>
@@ -9104,7 +9158,7 @@
           </w:pPr>
           <w:r>
             <w:rPr>
-              <w:rStyle w:val="Textodelmarcadordeposicin"/>
+              <w:rStyle w:val="PlaceholderText"/>
             </w:rPr>
             <w:t>Haga clic o pulse aquí para escribir texto.</w:t>
           </w:r>
@@ -9133,7 +9187,7 @@
           </w:pPr>
           <w:r>
             <w:rPr>
-              <w:rStyle w:val="Textodelmarcadordeposicin"/>
+              <w:rStyle w:val="PlaceholderText"/>
             </w:rPr>
             <w:t>Haga clic o pulse aquí para escribir texto.</w:t>
           </w:r>
@@ -9162,7 +9216,7 @@
           </w:pPr>
           <w:r>
             <w:rPr>
-              <w:rStyle w:val="Textodelmarcadordeposicin"/>
+              <w:rStyle w:val="PlaceholderText"/>
             </w:rPr>
             <w:t>Haga clic o pulse aquí para escribir texto.</w:t>
           </w:r>
@@ -9191,7 +9245,7 @@
           </w:pPr>
           <w:r>
             <w:rPr>
-              <w:rStyle w:val="Textodelmarcadordeposicin"/>
+              <w:rStyle w:val="PlaceholderText"/>
             </w:rPr>
             <w:t>Haga clic o pulse aquí para escribir texto.</w:t>
           </w:r>
@@ -9220,7 +9274,7 @@
           </w:pPr>
           <w:r>
             <w:rPr>
-              <w:rStyle w:val="Textodelmarcadordeposicin"/>
+              <w:rStyle w:val="PlaceholderText"/>
             </w:rPr>
             <w:t>Haga clic o pulse aquí para escribir texto.</w:t>
           </w:r>
@@ -9249,7 +9303,7 @@
           </w:pPr>
           <w:r>
             <w:rPr>
-              <w:rStyle w:val="Textodelmarcadordeposicin"/>
+              <w:rStyle w:val="PlaceholderText"/>
             </w:rPr>
             <w:t>Haga clic o pulse aquí para escribir texto.</w:t>
           </w:r>
@@ -9278,7 +9332,7 @@
           </w:pPr>
           <w:r>
             <w:rPr>
-              <w:rStyle w:val="Textodelmarcadordeposicin"/>
+              <w:rStyle w:val="PlaceholderText"/>
             </w:rPr>
             <w:t>Haga clic o pulse aquí para escribir texto.</w:t>
           </w:r>
@@ -9307,7 +9361,7 @@
           </w:pPr>
           <w:r>
             <w:rPr>
-              <w:rStyle w:val="Textodelmarcadordeposicin"/>
+              <w:rStyle w:val="PlaceholderText"/>
             </w:rPr>
             <w:t>Haga clic o pulse aquí para escribir texto.</w:t>
           </w:r>
@@ -9336,7 +9390,7 @@
           </w:pPr>
           <w:r>
             <w:rPr>
-              <w:rStyle w:val="Textodelmarcadordeposicin"/>
+              <w:rStyle w:val="PlaceholderText"/>
             </w:rPr>
             <w:t>Haga clic o pulse aquí para escribir texto.</w:t>
           </w:r>
@@ -9365,7 +9419,7 @@
           </w:pPr>
           <w:r>
             <w:rPr>
-              <w:rStyle w:val="Textodelmarcadordeposicin"/>
+              <w:rStyle w:val="PlaceholderText"/>
             </w:rPr>
             <w:t>Haga clic o pulse aquí para escribir texto.</w:t>
           </w:r>
@@ -9394,7 +9448,7 @@
           </w:pPr>
           <w:r>
             <w:rPr>
-              <w:rStyle w:val="Textodelmarcadordeposicin"/>
+              <w:rStyle w:val="PlaceholderText"/>
             </w:rPr>
             <w:t>Haga clic o pulse aquí para escribir texto.</w:t>
           </w:r>
@@ -9423,7 +9477,7 @@
           </w:pPr>
           <w:r>
             <w:rPr>
-              <w:rStyle w:val="Textodelmarcadordeposicin"/>
+              <w:rStyle w:val="PlaceholderText"/>
             </w:rPr>
             <w:t>Haga clic o pulse aquí para escribir texto.</w:t>
           </w:r>
@@ -9452,7 +9506,7 @@
           </w:pPr>
           <w:r>
             <w:rPr>
-              <w:rStyle w:val="Textodelmarcadordeposicin"/>
+              <w:rStyle w:val="PlaceholderText"/>
             </w:rPr>
             <w:t>Haga clic o pulse aquí para escribir texto.</w:t>
           </w:r>
@@ -9481,7 +9535,7 @@
           </w:pPr>
           <w:r>
             <w:rPr>
-              <w:rStyle w:val="Textodelmarcadordeposicin"/>
+              <w:rStyle w:val="PlaceholderText"/>
             </w:rPr>
             <w:t>Haga clic o pulse aquí para escribir texto.</w:t>
           </w:r>
@@ -9510,7 +9564,7 @@
           </w:pPr>
           <w:r>
             <w:rPr>
-              <w:rStyle w:val="Textodelmarcadordeposicin"/>
+              <w:rStyle w:val="PlaceholderText"/>
             </w:rPr>
             <w:t>Haga clic o pulse aquí para escribir texto.</w:t>
           </w:r>
@@ -9539,7 +9593,7 @@
           </w:pPr>
           <w:r>
             <w:rPr>
-              <w:rStyle w:val="Textodelmarcadordeposicin"/>
+              <w:rStyle w:val="PlaceholderText"/>
             </w:rPr>
             <w:t>Haga clic o pulse aquí para escribir texto.</w:t>
           </w:r>
@@ -9568,7 +9622,7 @@
           </w:pPr>
           <w:r>
             <w:rPr>
-              <w:rStyle w:val="Textodelmarcadordeposicin"/>
+              <w:rStyle w:val="PlaceholderText"/>
             </w:rPr>
             <w:t>Haga clic o pulse aquí para escribir texto.</w:t>
           </w:r>
@@ -9597,7 +9651,7 @@
           </w:pPr>
           <w:r>
             <w:rPr>
-              <w:rStyle w:val="Textodelmarcadordeposicin"/>
+              <w:rStyle w:val="PlaceholderText"/>
             </w:rPr>
             <w:t>Haga clic o pulse aquí para escribir texto.</w:t>
           </w:r>
@@ -9626,7 +9680,7 @@
           </w:pPr>
           <w:r>
             <w:rPr>
-              <w:rStyle w:val="Textodelmarcadordeposicin"/>
+              <w:rStyle w:val="PlaceholderText"/>
             </w:rPr>
             <w:t>Haga clic o pulse aquí para escribir texto.</w:t>
           </w:r>
@@ -9655,7 +9709,7 @@
           </w:pPr>
           <w:r>
             <w:rPr>
-              <w:rStyle w:val="Textodelmarcadordeposicin"/>
+              <w:rStyle w:val="PlaceholderText"/>
             </w:rPr>
             <w:t>Haga clic o pulse aquí para escribir texto.</w:t>
           </w:r>
@@ -9684,7 +9738,7 @@
           </w:pPr>
           <w:r>
             <w:rPr>
-              <w:rStyle w:val="Textodelmarcadordeposicin"/>
+              <w:rStyle w:val="PlaceholderText"/>
             </w:rPr>
             <w:t>Haga clic o pulse aquí para escribir texto.</w:t>
           </w:r>
@@ -9713,7 +9767,7 @@
           </w:pPr>
           <w:r>
             <w:rPr>
-              <w:rStyle w:val="Textodelmarcadordeposicin"/>
+              <w:rStyle w:val="PlaceholderText"/>
             </w:rPr>
             <w:t>Haga clic o pulse aquí para escribir texto.</w:t>
           </w:r>
@@ -9742,7 +9796,7 @@
           </w:pPr>
           <w:r>
             <w:rPr>
-              <w:rStyle w:val="Textodelmarcadordeposicin"/>
+              <w:rStyle w:val="PlaceholderText"/>
             </w:rPr>
             <w:t>Haga clic o pulse aquí para escribir texto.</w:t>
           </w:r>
@@ -9771,7 +9825,7 @@
           </w:pPr>
           <w:r>
             <w:rPr>
-              <w:rStyle w:val="Textodelmarcadordeposicin"/>
+              <w:rStyle w:val="PlaceholderText"/>
             </w:rPr>
             <w:t>Haga clic o pulse aquí para escribir texto.</w:t>
           </w:r>
@@ -9800,7 +9854,7 @@
           </w:pPr>
           <w:r>
             <w:rPr>
-              <w:rStyle w:val="Textodelmarcadordeposicin"/>
+              <w:rStyle w:val="PlaceholderText"/>
             </w:rPr>
             <w:t>Haga clic o pulse aquí para escribir texto.</w:t>
           </w:r>
@@ -9829,7 +9883,7 @@
           </w:pPr>
           <w:r>
             <w:rPr>
-              <w:rStyle w:val="Textodelmarcadordeposicin"/>
+              <w:rStyle w:val="PlaceholderText"/>
             </w:rPr>
             <w:t>Haga clic o pulse aquí para escribir texto.</w:t>
           </w:r>
@@ -9858,7 +9912,7 @@
           </w:pPr>
           <w:r>
             <w:rPr>
-              <w:rStyle w:val="Textodelmarcadordeposicin"/>
+              <w:rStyle w:val="PlaceholderText"/>
             </w:rPr>
             <w:t>Haga clic o pulse aquí para escribir texto.</w:t>
           </w:r>
@@ -9887,7 +9941,7 @@
           </w:pPr>
           <w:r>
             <w:rPr>
-              <w:rStyle w:val="Textodelmarcadordeposicin"/>
+              <w:rStyle w:val="PlaceholderText"/>
             </w:rPr>
             <w:t>Haga clic o pulse aquí para escribir texto.</w:t>
           </w:r>
@@ -9916,7 +9970,7 @@
           </w:pPr>
           <w:r>
             <w:rPr>
-              <w:rStyle w:val="Textodelmarcadordeposicin"/>
+              <w:rStyle w:val="PlaceholderText"/>
             </w:rPr>
             <w:t>Haga clic o pulse aquí para escribir texto.</w:t>
           </w:r>
@@ -9945,7 +9999,7 @@
           </w:pPr>
           <w:r>
             <w:rPr>
-              <w:rStyle w:val="Textodelmarcadordeposicin"/>
+              <w:rStyle w:val="PlaceholderText"/>
             </w:rPr>
             <w:t>Haga clic o pulse aquí para escribir texto.</w:t>
           </w:r>
@@ -9974,7 +10028,7 @@
           </w:pPr>
           <w:r>
             <w:rPr>
-              <w:rStyle w:val="Textodelmarcadordeposicin"/>
+              <w:rStyle w:val="PlaceholderText"/>
             </w:rPr>
             <w:t>Haga clic o pulse aquí para escribir texto.</w:t>
           </w:r>
@@ -10003,7 +10057,7 @@
           </w:pPr>
           <w:r>
             <w:rPr>
-              <w:rStyle w:val="Textodelmarcadordeposicin"/>
+              <w:rStyle w:val="PlaceholderText"/>
             </w:rPr>
             <w:t>Haga clic o pulse aquí para escribir texto.</w:t>
           </w:r>
@@ -10032,7 +10086,7 @@
           </w:pPr>
           <w:r>
             <w:rPr>
-              <w:rStyle w:val="Textodelmarcadordeposicin"/>
+              <w:rStyle w:val="PlaceholderText"/>
             </w:rPr>
             <w:t>Haga clic o pulse aquí para escribir texto.</w:t>
           </w:r>
@@ -10061,7 +10115,7 @@
           </w:pPr>
           <w:r>
             <w:rPr>
-              <w:rStyle w:val="Textodelmarcadordeposicin"/>
+              <w:rStyle w:val="PlaceholderText"/>
             </w:rPr>
             <w:t>Haga clic o pulse aquí para escribir texto.</w:t>
           </w:r>
@@ -10090,7 +10144,7 @@
           </w:pPr>
           <w:r>
             <w:rPr>
-              <w:rStyle w:val="Textodelmarcadordeposicin"/>
+              <w:rStyle w:val="PlaceholderText"/>
             </w:rPr>
             <w:t>Haga clic o pulse aquí para escribir texto.</w:t>
           </w:r>
@@ -10119,7 +10173,7 @@
           </w:pPr>
           <w:r>
             <w:rPr>
-              <w:rStyle w:val="Textodelmarcadordeposicin"/>
+              <w:rStyle w:val="PlaceholderText"/>
             </w:rPr>
             <w:t>Haga clic o pulse aquí para escribir texto.</w:t>
           </w:r>
@@ -10148,7 +10202,7 @@
           </w:pPr>
           <w:r>
             <w:rPr>
-              <w:rStyle w:val="Textodelmarcadordeposicin"/>
+              <w:rStyle w:val="PlaceholderText"/>
             </w:rPr>
             <w:t>Haga clic o pulse aquí para escribir texto.</w:t>
           </w:r>
@@ -10177,7 +10231,7 @@
           </w:pPr>
           <w:r>
             <w:rPr>
-              <w:rStyle w:val="Textodelmarcadordeposicin"/>
+              <w:rStyle w:val="PlaceholderText"/>
             </w:rPr>
             <w:t>Haga clic o pulse aquí para escribir texto.</w:t>
           </w:r>
@@ -10305,12 +10359,14 @@
     <w:rsid w:val="008B1087"/>
     <w:rsid w:val="0093034B"/>
     <w:rsid w:val="00953D97"/>
+    <w:rsid w:val="009E5173"/>
     <w:rsid w:val="00A222AC"/>
     <w:rsid w:val="00A47EDD"/>
     <w:rsid w:val="00AD2A82"/>
     <w:rsid w:val="00AD7444"/>
     <w:rsid w:val="00AE0F65"/>
     <w:rsid w:val="00B30056"/>
+    <w:rsid w:val="00B41EEB"/>
     <w:rsid w:val="00B50831"/>
     <w:rsid w:val="00BB57C2"/>
     <w:rsid w:val="00BE3A2B"/>
@@ -10752,13 +10808,13 @@
     <w:name w:val="Normal"/>
     <w:qFormat/>
   </w:style>
-  <w:style w:type="character" w:default="1" w:styleId="Fuentedeprrafopredeter">
+  <w:style w:type="character" w:default="1" w:styleId="DefaultParagraphFont">
     <w:name w:val="Default Paragraph Font"/>
     <w:uiPriority w:val="1"/>
     <w:semiHidden/>
     <w:unhideWhenUsed/>
   </w:style>
-  <w:style w:type="table" w:default="1" w:styleId="Tablanormal">
+  <w:style w:type="table" w:default="1" w:styleId="TableNormal">
     <w:name w:val="Normal Table"/>
     <w:uiPriority w:val="99"/>
     <w:semiHidden/>
@@ -10773,15 +10829,15 @@
       </w:tblCellMar>
     </w:tblPr>
   </w:style>
-  <w:style w:type="numbering" w:default="1" w:styleId="Sinlista">
+  <w:style w:type="numbering" w:default="1" w:styleId="NoList">
     <w:name w:val="No List"/>
     <w:uiPriority w:val="99"/>
     <w:semiHidden/>
     <w:unhideWhenUsed/>
   </w:style>
-  <w:style w:type="character" w:styleId="Textodelmarcadordeposicin">
+  <w:style w:type="character" w:styleId="PlaceholderText">
     <w:name w:val="Placeholder Text"/>
-    <w:basedOn w:val="Fuentedeprrafopredeter"/>
+    <w:basedOn w:val="DefaultParagraphFont"/>
     <w:uiPriority w:val="99"/>
     <w:semiHidden/>
     <w:rsid w:val="00AD2A82"/>

</xml_diff>